<commit_message>
feat(nereu-ms): sugestao de suspensao ate transito em julgado do MS no modelo
</commit_message>
<xml_diff>
--- a/scripts/automacao/templates/modelo_nereu_ms/modelo_nereu.docx
+++ b/scripts/automacao/templates/modelo_nereu_ms/modelo_nereu.docx
@@ -47,7 +47,7 @@
     </w:p>
     <w:p>
       <w:pPr>
-        <w:shd w:val="clear" w:color="auto" w:fill="D9D9D9" w:themeFill="background1" w:themeFillShade="D9"/>
+        <w:shd w:val="clear" w:color="auto" w:fill="FFFFFF" w:themeFill="background1"/>
         <w:spacing w:line="360" w:lineRule="auto"/>
         <w:ind w:left="851" w:hanging="851"/>
         <w:jc w:val="center"/>
@@ -59,9 +59,8 @@
       <w:r>
         <w:rPr>
           <w:b/>
-          <w:color w:val="1A3D28"/>
-        </w:rPr>
-        <w:t>DESPACHO</w:t>
+        </w:rPr>
+        <w:t>INFORMAÇÃO INSTRUTIVA</w:t>
       </w:r>
     </w:p>
     <w:p>
@@ -69,29 +68,6 @@
         <w:spacing w:line="360" w:lineRule="auto"/>
         <w:rPr>
           <w:sz w:val="28"/>
-        </w:rPr>
-      </w:pPr>
-    </w:p>
-    <w:p>
-      <w:pPr>
-        <w:spacing w:line="360" w:lineRule="auto"/>
-        <w:ind w:firstLine="1701"/>
-        <w:jc w:val="both"/>
-        <w:rPr>
-          <w:szCs w:val="20"/>
-        </w:rPr>
-      </w:pPr>
-      <w:r>
-        <w:t>O presente processo relaciona-se às penalidades impostas ao Sr. NEREU BATISTA LINHARES, presidente do Instituto de Previdência dos Servidores do Estado do Rio Grande do Norte (IPERN), em razão do descumprimento de determinações deste Tribunal de Contas. Cumpre registrar fato superveniente com repercussão direta sobre a matéria destes autos.</w:t>
-      </w:r>
-    </w:p>
-    <w:p>
-      <w:pPr>
-        <w:spacing w:line="360" w:lineRule="auto"/>
-        <w:ind w:firstLine="1701"/>
-        <w:jc w:val="both"/>
-        <w:rPr>
-          <w:szCs w:val="20"/>
         </w:rPr>
       </w:pPr>
     </w:p>
@@ -102,7 +78,10 @@
         <w:jc w:val="both"/>
       </w:pPr>
       <w:r>
-        <w:t>Em 29 de junho de 2026, o Tribunal Pleno do Tribunal de Justiça do Rio Grande do Norte, ao julgar o Mandado de Segurança Cível nº 0807247-93.2025.8.20.0000, concedeu a segurança e determinou a anulação de todas as multas aplicadas por este Tribunal de Contas por descumprimento de determinações relativas às vantagens remuneratórias discutidas no processo nº 0811707-97.2021.8.20.5001. Destaque-se que a segurança concedida abrange exclusivamente as vantagens remuneratórias transitórias de servidores da área da saúde, objeto do referido processo judicial.</w:t>
+        <w:t>O presente processo relaciona-se às penalidades impostas ao Sr. NEREU BATISTA LINHARES, presidente do Instituto de Previdência dos Servidores do Estado do Rio Grande do Norte (IPERN), em razão do descumprimento de determinações deste Tribunal de Contas</w:t>
+      </w:r>
+      <w:r>
+        <w:t xml:space="preserve">. </w:t>
       </w:r>
     </w:p>
     <w:p>
@@ -115,39 +94,74 @@
         </w:rPr>
       </w:pPr>
       <w:r>
+        <w:t xml:space="preserve">Cumpre registrar fato superveniente com repercussão direta sobre a matéria destes autos. </w:t>
+      </w:r>
+      <w:r>
+        <w:t>Em 29 de junho de 2026, o Tribunal Pleno do Tribunal de Justiça do Rio Grande do Norte, ao julgar o Mandado de Segurança Cível nº 0807247-93.2025.8.20.0000, concedeu a segurança e determinou a anulação de todas as multas aplicadas por este Tribunal de Contas por descumprimento de determinações relativas às vantagens remuneratórias discutidas no processo nº 0811707-97.2021.8.20.5001. Destaque-se que a segurança concedida abrange exclusivamente as vantagens remuneratórias transitórias de servidores</w:t>
+      </w:r>
+      <w:r>
+        <w:t xml:space="preserve"> estaduais</w:t>
+      </w:r>
+      <w:r>
+        <w:t xml:space="preserve"> da área da saúde, objeto do referido processo judicial.</w:t>
+      </w:r>
+    </w:p>
+    <w:p>
+      <w:pPr>
+        <w:spacing w:line="360" w:lineRule="auto"/>
+        <w:ind w:firstLine="1701"/>
+        <w:jc w:val="both"/>
         <w:rPr>
           <w:szCs w:val="20"/>
         </w:rPr>
-        <w:t>Ressalta-se que o presente processo {{resumo_debitos}}</w:t>
+      </w:pPr>
+      <w:r>
+        <w:rPr>
+          <w:szCs w:val="20"/>
+        </w:rPr>
+        <w:t>Ressalta-se que o presente processo {{</w:t>
+      </w:r>
+      <w:proofErr w:type="spellStart"/>
+      <w:r>
+        <w:rPr>
+          <w:szCs w:val="20"/>
+        </w:rPr>
+        <w:t>resumo_debitos</w:t>
+      </w:r>
+      <w:proofErr w:type="spellEnd"/>
+      <w:r>
+        <w:rPr>
+          <w:szCs w:val="20"/>
+        </w:rPr>
+        <w:t>}}</w:t>
       </w:r>
     </w:p>
     <w:tbl>
       <w:tblPr>
-        <w:tblW w:type="auto" w:w="0"/>
-        <w:tblLook w:firstColumn="1" w:firstRow="1" w:lastColumn="0" w:lastRow="0" w:noHBand="0" w:noVBand="1" w:val="04A0"/>
-        <w:tblW w:type="pct" w:w="5000"/>
+        <w:tblW w:w="5000" w:type="pct"/>
         <w:tblBorders>
-          <w:top w:val="single" w:sz="8" w:color="2E5B3C"/>
-          <w:left w:val="single" w:sz="8" w:color="2E5B3C"/>
-          <w:bottom w:val="single" w:sz="8" w:color="2E5B3C"/>
-          <w:right w:val="single" w:sz="8" w:color="2E5B3C"/>
-          <w:insideH w:val="single" w:sz="4" w:color="CCCCCC"/>
-          <w:insideV w:val="single" w:sz="4" w:color="CCCCCC"/>
+          <w:top w:val="single" w:sz="8" w:space="0" w:color="2E5B3C"/>
+          <w:left w:val="single" w:sz="8" w:space="0" w:color="2E5B3C"/>
+          <w:bottom w:val="single" w:sz="8" w:space="0" w:color="2E5B3C"/>
+          <w:right w:val="single" w:sz="8" w:space="0" w:color="2E5B3C"/>
+          <w:insideH w:val="single" w:sz="4" w:space="0" w:color="CCCCCC"/>
+          <w:insideV w:val="single" w:sz="4" w:space="0" w:color="CCCCCC"/>
         </w:tblBorders>
+        <w:tblLook w:val="04A0" w:firstRow="1" w:lastRow="0" w:firstColumn="1" w:lastColumn="0" w:noHBand="0" w:noVBand="1"/>
       </w:tblPr>
       <w:tblGrid>
-        <w:gridCol w:w="1624"/>
-        <w:gridCol w:w="1624"/>
-        <w:gridCol w:w="1624"/>
-        <w:gridCol w:w="1624"/>
-        <w:gridCol w:w="1624"/>
-        <w:gridCol w:w="1624"/>
+        <w:gridCol w:w="1810"/>
+        <w:gridCol w:w="2072"/>
+        <w:gridCol w:w="1373"/>
+        <w:gridCol w:w="1439"/>
+        <w:gridCol w:w="1680"/>
+        <w:gridCol w:w="1352"/>
       </w:tblGrid>
       <w:tr>
         <w:tc>
           <w:tcPr>
-            <w:tcW w:type="dxa" w:w="1624"/>
-            <w:shd w:val="clear" w:fill="2E5B3C"/>
+            <w:tcW w:w="1624" w:type="dxa"/>
+            <w:shd w:val="clear" w:color="auto" w:fill="2E5B3C"/>
           </w:tcPr>
           <w:p>
             <w:pPr>
@@ -166,8 +180,8 @@
         </w:tc>
         <w:tc>
           <w:tcPr>
-            <w:tcW w:type="dxa" w:w="1624"/>
-            <w:shd w:val="clear" w:fill="2E5B3C"/>
+            <w:tcW w:w="1624" w:type="dxa"/>
+            <w:shd w:val="clear" w:color="auto" w:fill="2E5B3C"/>
           </w:tcPr>
           <w:p>
             <w:pPr>
@@ -180,14 +194,34 @@
                 <w:color w:val="FFFFFF"/>
                 <w:sz w:val="20"/>
               </w:rPr>
-              <w:t>Valor atualizado ({{posicao}})</w:t>
+              <w:t>Valor atualizado ({{</w:t>
+            </w:r>
+            <w:proofErr w:type="spellStart"/>
+            <w:r>
+              <w:rPr>
+                <w:rFonts w:ascii="Arial" w:hAnsi="Arial"/>
+                <w:b/>
+                <w:color w:val="FFFFFF"/>
+                <w:sz w:val="20"/>
+              </w:rPr>
+              <w:t>posicao</w:t>
+            </w:r>
+            <w:proofErr w:type="spellEnd"/>
+            <w:r>
+              <w:rPr>
+                <w:rFonts w:ascii="Arial" w:hAnsi="Arial"/>
+                <w:b/>
+                <w:color w:val="FFFFFF"/>
+                <w:sz w:val="20"/>
+              </w:rPr>
+              <w:t>}})</w:t>
             </w:r>
           </w:p>
         </w:tc>
         <w:tc>
           <w:tcPr>
-            <w:tcW w:type="dxa" w:w="1624"/>
-            <w:shd w:val="clear" w:fill="2E5B3C"/>
+            <w:tcW w:w="1624" w:type="dxa"/>
+            <w:shd w:val="clear" w:color="auto" w:fill="2E5B3C"/>
           </w:tcPr>
           <w:p>
             <w:pPr>
@@ -206,8 +240,8 @@
         </w:tc>
         <w:tc>
           <w:tcPr>
-            <w:tcW w:type="dxa" w:w="1624"/>
-            <w:shd w:val="clear" w:fill="2E5B3C"/>
+            <w:tcW w:w="1624" w:type="dxa"/>
+            <w:shd w:val="clear" w:color="auto" w:fill="2E5B3C"/>
           </w:tcPr>
           <w:p>
             <w:pPr>
@@ -226,8 +260,8 @@
         </w:tc>
         <w:tc>
           <w:tcPr>
-            <w:tcW w:type="dxa" w:w="1624"/>
-            <w:shd w:val="clear" w:fill="2E5B3C"/>
+            <w:tcW w:w="1624" w:type="dxa"/>
+            <w:shd w:val="clear" w:color="auto" w:fill="2E5B3C"/>
           </w:tcPr>
           <w:p>
             <w:pPr>
@@ -246,8 +280,8 @@
         </w:tc>
         <w:tc>
           <w:tcPr>
-            <w:tcW w:type="dxa" w:w="1624"/>
-            <w:shd w:val="clear" w:fill="2E5B3C"/>
+            <w:tcW w:w="1624" w:type="dxa"/>
+            <w:shd w:val="clear" w:color="auto" w:fill="2E5B3C"/>
           </w:tcPr>
           <w:p>
             <w:pPr>
@@ -268,7 +302,131 @@
       <w:tr>
         <w:tc>
           <w:tcPr>
-            <w:tcW w:type="dxa" w:w="1624"/>
+            <w:tcW w:w="1624" w:type="dxa"/>
+          </w:tcPr>
+          <w:p>
+            <w:pPr>
+              <w:jc w:val="center"/>
+              <w:rPr>
+                <w:lang w:val="en-US"/>
+              </w:rPr>
+            </w:pPr>
+            <w:r>
+              <w:rPr>
+                <w:rFonts w:ascii="Arial" w:hAnsi="Arial"/>
+                <w:color w:val="333333"/>
+                <w:sz w:val="20"/>
+                <w:lang w:val="en-US"/>
+              </w:rPr>
+              <w:t xml:space="preserve">{%tr </w:t>
+            </w:r>
+            <w:proofErr w:type="spellStart"/>
+            <w:r>
+              <w:rPr>
+                <w:rFonts w:ascii="Arial" w:hAnsi="Arial"/>
+                <w:color w:val="333333"/>
+                <w:sz w:val="20"/>
+                <w:lang w:val="en-US"/>
+              </w:rPr>
+              <w:t>for d</w:t>
+            </w:r>
+            <w:proofErr w:type="spellEnd"/>
+            <w:r>
+              <w:rPr>
+                <w:rFonts w:ascii="Arial" w:hAnsi="Arial"/>
+                <w:color w:val="333333"/>
+                <w:sz w:val="20"/>
+                <w:lang w:val="en-US"/>
+              </w:rPr>
+              <w:t xml:space="preserve"> in </w:t>
+            </w:r>
+            <w:proofErr w:type="spellStart"/>
+            <w:r>
+              <w:rPr>
+                <w:rFonts w:ascii="Arial" w:hAnsi="Arial"/>
+                <w:color w:val="333333"/>
+                <w:sz w:val="20"/>
+                <w:lang w:val="en-US"/>
+              </w:rPr>
+              <w:t>debitos</w:t>
+            </w:r>
+            <w:proofErr w:type="spellEnd"/>
+            <w:r>
+              <w:rPr>
+                <w:rFonts w:ascii="Arial" w:hAnsi="Arial"/>
+                <w:color w:val="333333"/>
+                <w:sz w:val="20"/>
+                <w:lang w:val="en-US"/>
+              </w:rPr>
+              <w:t xml:space="preserve"> %}</w:t>
+            </w:r>
+          </w:p>
+        </w:tc>
+        <w:tc>
+          <w:tcPr>
+            <w:tcW w:w="1624" w:type="dxa"/>
+          </w:tcPr>
+          <w:p>
+            <w:pPr>
+              <w:rPr>
+                <w:lang w:val="en-US"/>
+              </w:rPr>
+            </w:pPr>
+          </w:p>
+        </w:tc>
+        <w:tc>
+          <w:tcPr>
+            <w:tcW w:w="1624" w:type="dxa"/>
+          </w:tcPr>
+          <w:p>
+            <w:pPr>
+              <w:rPr>
+                <w:lang w:val="en-US"/>
+              </w:rPr>
+            </w:pPr>
+          </w:p>
+        </w:tc>
+        <w:tc>
+          <w:tcPr>
+            <w:tcW w:w="1624" w:type="dxa"/>
+          </w:tcPr>
+          <w:p>
+            <w:pPr>
+              <w:rPr>
+                <w:lang w:val="en-US"/>
+              </w:rPr>
+            </w:pPr>
+          </w:p>
+        </w:tc>
+        <w:tc>
+          <w:tcPr>
+            <w:tcW w:w="1624" w:type="dxa"/>
+          </w:tcPr>
+          <w:p>
+            <w:pPr>
+              <w:rPr>
+                <w:lang w:val="en-US"/>
+              </w:rPr>
+            </w:pPr>
+          </w:p>
+        </w:tc>
+        <w:tc>
+          <w:tcPr>
+            <w:tcW w:w="1624" w:type="dxa"/>
+          </w:tcPr>
+          <w:p>
+            <w:pPr>
+              <w:rPr>
+                <w:lang w:val="en-US"/>
+              </w:rPr>
+            </w:pPr>
+          </w:p>
+        </w:tc>
+      </w:tr>
+      <w:tr>
+        <w:tc>
+          <w:tcPr>
+            <w:tcW w:w="1624" w:type="dxa"/>
           </w:tcPr>
           <w:p>
             <w:pPr>
@@ -277,49 +435,44 @@
             <w:r>
               <w:rPr>
                 <w:rFonts w:ascii="Arial" w:hAnsi="Arial"/>
-                <w:b w:val="0"/>
-                <w:color w:val="333333"/>
-                <w:sz w:val="20"/>
-              </w:rPr>
-              <w:t>{%tr for d in debitos %}</w:t>
+                <w:color w:val="333333"/>
+                <w:sz w:val="20"/>
+              </w:rPr>
+              <w:t>{{</w:t>
+            </w:r>
+            <w:proofErr w:type="spellStart"/>
+            <w:proofErr w:type="gramStart"/>
+            <w:r>
+              <w:rPr>
+                <w:rFonts w:ascii="Arial" w:hAnsi="Arial"/>
+                <w:color w:val="333333"/>
+                <w:sz w:val="20"/>
+              </w:rPr>
+              <w:t>d.valor</w:t>
+            </w:r>
+            <w:proofErr w:type="gramEnd"/>
+            <w:r>
+              <w:rPr>
+                <w:rFonts w:ascii="Arial" w:hAnsi="Arial"/>
+                <w:color w:val="333333"/>
+                <w:sz w:val="20"/>
+              </w:rPr>
+              <w:t>_original</w:t>
+            </w:r>
+            <w:proofErr w:type="spellEnd"/>
+            <w:r>
+              <w:rPr>
+                <w:rFonts w:ascii="Arial" w:hAnsi="Arial"/>
+                <w:color w:val="333333"/>
+                <w:sz w:val="20"/>
+              </w:rPr>
+              <w:t>}}</w:t>
             </w:r>
           </w:p>
         </w:tc>
         <w:tc>
           <w:tcPr>
-            <w:tcW w:type="dxa" w:w="1624"/>
-          </w:tcPr>
-          <w:p/>
-        </w:tc>
-        <w:tc>
-          <w:tcPr>
-            <w:tcW w:type="dxa" w:w="1624"/>
-          </w:tcPr>
-          <w:p/>
-        </w:tc>
-        <w:tc>
-          <w:tcPr>
-            <w:tcW w:type="dxa" w:w="1624"/>
-          </w:tcPr>
-          <w:p/>
-        </w:tc>
-        <w:tc>
-          <w:tcPr>
-            <w:tcW w:type="dxa" w:w="1624"/>
-          </w:tcPr>
-          <w:p/>
-        </w:tc>
-        <w:tc>
-          <w:tcPr>
-            <w:tcW w:type="dxa" w:w="1624"/>
-          </w:tcPr>
-          <w:p/>
-        </w:tc>
-      </w:tr>
-      <w:tr>
-        <w:tc>
-          <w:tcPr>
-            <w:tcW w:type="dxa" w:w="1624"/>
+            <w:tcW w:w="1624" w:type="dxa"/>
           </w:tcPr>
           <w:p>
             <w:pPr>
@@ -328,17 +481,44 @@
             <w:r>
               <w:rPr>
                 <w:rFonts w:ascii="Arial" w:hAnsi="Arial"/>
-                <w:b w:val="0"/>
-                <w:color w:val="333333"/>
-                <w:sz w:val="20"/>
-              </w:rPr>
-              <w:t>{{d.valor_original}}</w:t>
+                <w:color w:val="333333"/>
+                <w:sz w:val="20"/>
+              </w:rPr>
+              <w:t>{{</w:t>
+            </w:r>
+            <w:proofErr w:type="spellStart"/>
+            <w:proofErr w:type="gramStart"/>
+            <w:r>
+              <w:rPr>
+                <w:rFonts w:ascii="Arial" w:hAnsi="Arial"/>
+                <w:color w:val="333333"/>
+                <w:sz w:val="20"/>
+              </w:rPr>
+              <w:t>d.valor</w:t>
+            </w:r>
+            <w:proofErr w:type="gramEnd"/>
+            <w:r>
+              <w:rPr>
+                <w:rFonts w:ascii="Arial" w:hAnsi="Arial"/>
+                <w:color w:val="333333"/>
+                <w:sz w:val="20"/>
+              </w:rPr>
+              <w:t>_atualizado</w:t>
+            </w:r>
+            <w:proofErr w:type="spellEnd"/>
+            <w:r>
+              <w:rPr>
+                <w:rFonts w:ascii="Arial" w:hAnsi="Arial"/>
+                <w:color w:val="333333"/>
+                <w:sz w:val="20"/>
+              </w:rPr>
+              <w:t>}}</w:t>
             </w:r>
           </w:p>
         </w:tc>
         <w:tc>
           <w:tcPr>
-            <w:tcW w:type="dxa" w:w="1624"/>
+            <w:tcW w:w="1624" w:type="dxa"/>
           </w:tcPr>
           <w:p>
             <w:pPr>
@@ -347,17 +527,36 @@
             <w:r>
               <w:rPr>
                 <w:rFonts w:ascii="Arial" w:hAnsi="Arial"/>
-                <w:b w:val="0"/>
-                <w:color w:val="333333"/>
-                <w:sz w:val="20"/>
-              </w:rPr>
-              <w:t>{{d.valor_atualizado}}</w:t>
+                <w:color w:val="333333"/>
+                <w:sz w:val="20"/>
+              </w:rPr>
+              <w:t>{{</w:t>
+            </w:r>
+            <w:proofErr w:type="spellStart"/>
+            <w:proofErr w:type="gramStart"/>
+            <w:r>
+              <w:rPr>
+                <w:rFonts w:ascii="Arial" w:hAnsi="Arial"/>
+                <w:color w:val="333333"/>
+                <w:sz w:val="20"/>
+              </w:rPr>
+              <w:t>d.situacao</w:t>
+            </w:r>
+            <w:proofErr w:type="spellEnd"/>
+            <w:proofErr w:type="gramEnd"/>
+            <w:r>
+              <w:rPr>
+                <w:rFonts w:ascii="Arial" w:hAnsi="Arial"/>
+                <w:color w:val="333333"/>
+                <w:sz w:val="20"/>
+              </w:rPr>
+              <w:t>}}</w:t>
             </w:r>
           </w:p>
         </w:tc>
         <w:tc>
           <w:tcPr>
-            <w:tcW w:type="dxa" w:w="1624"/>
+            <w:tcW w:w="1624" w:type="dxa"/>
           </w:tcPr>
           <w:p>
             <w:pPr>
@@ -366,17 +565,36 @@
             <w:r>
               <w:rPr>
                 <w:rFonts w:ascii="Arial" w:hAnsi="Arial"/>
-                <w:b w:val="0"/>
-                <w:color w:val="333333"/>
-                <w:sz w:val="20"/>
-              </w:rPr>
-              <w:t>{{d.situacao}}</w:t>
+                <w:color w:val="333333"/>
+                <w:sz w:val="20"/>
+              </w:rPr>
+              <w:t>{{</w:t>
+            </w:r>
+            <w:proofErr w:type="spellStart"/>
+            <w:proofErr w:type="gramStart"/>
+            <w:r>
+              <w:rPr>
+                <w:rFonts w:ascii="Arial" w:hAnsi="Arial"/>
+                <w:color w:val="333333"/>
+                <w:sz w:val="20"/>
+              </w:rPr>
+              <w:t>d.desconto</w:t>
+            </w:r>
+            <w:proofErr w:type="spellEnd"/>
+            <w:proofErr w:type="gramEnd"/>
+            <w:r>
+              <w:rPr>
+                <w:rFonts w:ascii="Arial" w:hAnsi="Arial"/>
+                <w:color w:val="333333"/>
+                <w:sz w:val="20"/>
+              </w:rPr>
+              <w:t>}}</w:t>
             </w:r>
           </w:p>
         </w:tc>
         <w:tc>
           <w:tcPr>
-            <w:tcW w:type="dxa" w:w="1624"/>
+            <w:tcW w:w="1624" w:type="dxa"/>
           </w:tcPr>
           <w:p>
             <w:pPr>
@@ -385,17 +603,44 @@
             <w:r>
               <w:rPr>
                 <w:rFonts w:ascii="Arial" w:hAnsi="Arial"/>
-                <w:b w:val="0"/>
-                <w:color w:val="333333"/>
-                <w:sz w:val="20"/>
-              </w:rPr>
-              <w:t>{{d.desconto}}</w:t>
+                <w:color w:val="333333"/>
+                <w:sz w:val="20"/>
+              </w:rPr>
+              <w:t>{{</w:t>
+            </w:r>
+            <w:proofErr w:type="spellStart"/>
+            <w:proofErr w:type="gramStart"/>
+            <w:r>
+              <w:rPr>
+                <w:rFonts w:ascii="Arial" w:hAnsi="Arial"/>
+                <w:color w:val="333333"/>
+                <w:sz w:val="20"/>
+              </w:rPr>
+              <w:t>d.divida</w:t>
+            </w:r>
+            <w:proofErr w:type="gramEnd"/>
+            <w:r>
+              <w:rPr>
+                <w:rFonts w:ascii="Arial" w:hAnsi="Arial"/>
+                <w:color w:val="333333"/>
+                <w:sz w:val="20"/>
+              </w:rPr>
+              <w:t>_ativa</w:t>
+            </w:r>
+            <w:proofErr w:type="spellEnd"/>
+            <w:r>
+              <w:rPr>
+                <w:rFonts w:ascii="Arial" w:hAnsi="Arial"/>
+                <w:color w:val="333333"/>
+                <w:sz w:val="20"/>
+              </w:rPr>
+              <w:t>}}</w:t>
             </w:r>
           </w:p>
         </w:tc>
         <w:tc>
           <w:tcPr>
-            <w:tcW w:type="dxa" w:w="1624"/>
+            <w:tcW w:w="1624" w:type="dxa"/>
           </w:tcPr>
           <w:p>
             <w:pPr>
@@ -404,17 +649,38 @@
             <w:r>
               <w:rPr>
                 <w:rFonts w:ascii="Arial" w:hAnsi="Arial"/>
-                <w:b w:val="0"/>
-                <w:color w:val="333333"/>
-                <w:sz w:val="20"/>
-              </w:rPr>
-              <w:t>{{d.divida_ativa}}</w:t>
+                <w:color w:val="333333"/>
+                <w:sz w:val="20"/>
+              </w:rPr>
+              <w:t>{{</w:t>
+            </w:r>
+            <w:proofErr w:type="spellStart"/>
+            <w:proofErr w:type="gramStart"/>
+            <w:r>
+              <w:rPr>
+                <w:rFonts w:ascii="Arial" w:hAnsi="Arial"/>
+                <w:color w:val="333333"/>
+                <w:sz w:val="20"/>
+              </w:rPr>
+              <w:t>d.protesto</w:t>
+            </w:r>
+            <w:proofErr w:type="spellEnd"/>
+            <w:proofErr w:type="gramEnd"/>
+            <w:r>
+              <w:rPr>
+                <w:rFonts w:ascii="Arial" w:hAnsi="Arial"/>
+                <w:color w:val="333333"/>
+                <w:sz w:val="20"/>
+              </w:rPr>
+              <w:t>}}</w:t>
             </w:r>
           </w:p>
         </w:tc>
-        <w:tc>
-          <w:tcPr>
-            <w:tcW w:type="dxa" w:w="1624"/>
+      </w:tr>
+      <w:tr>
+        <w:tc>
+          <w:tcPr>
+            <w:tcW w:w="1624" w:type="dxa"/>
           </w:tcPr>
           <w:p>
             <w:pPr>
@@ -423,62 +689,76 @@
             <w:r>
               <w:rPr>
                 <w:rFonts w:ascii="Arial" w:hAnsi="Arial"/>
-                <w:b w:val="0"/>
-                <w:color w:val="333333"/>
-                <w:sz w:val="20"/>
-              </w:rPr>
-              <w:t>{{d.protesto}}</w:t>
+                <w:color w:val="333333"/>
+                <w:sz w:val="20"/>
+              </w:rPr>
+              <w:t>{%</w:t>
+            </w:r>
+            <w:proofErr w:type="spellStart"/>
+            <w:r>
+              <w:rPr>
+                <w:rFonts w:ascii="Arial" w:hAnsi="Arial"/>
+                <w:color w:val="333333"/>
+                <w:sz w:val="20"/>
+              </w:rPr>
+              <w:t>tr</w:t>
+            </w:r>
+            <w:proofErr w:type="spellEnd"/>
+            <w:r>
+              <w:rPr>
+                <w:rFonts w:ascii="Arial" w:hAnsi="Arial"/>
+                <w:color w:val="333333"/>
+                <w:sz w:val="20"/>
+              </w:rPr>
+              <w:t xml:space="preserve"> </w:t>
+            </w:r>
+            <w:proofErr w:type="spellStart"/>
+            <w:r>
+              <w:rPr>
+                <w:rFonts w:ascii="Arial" w:hAnsi="Arial"/>
+                <w:color w:val="333333"/>
+                <w:sz w:val="20"/>
+              </w:rPr>
+              <w:t>endfor</w:t>
+            </w:r>
+            <w:proofErr w:type="spellEnd"/>
+            <w:r>
+              <w:rPr>
+                <w:rFonts w:ascii="Arial" w:hAnsi="Arial"/>
+                <w:color w:val="333333"/>
+                <w:sz w:val="20"/>
+              </w:rPr>
+              <w:t xml:space="preserve"> %}</w:t>
             </w:r>
           </w:p>
         </w:tc>
-      </w:tr>
-      <w:tr>
-        <w:tc>
-          <w:tcPr>
-            <w:tcW w:type="dxa" w:w="1624"/>
-          </w:tcPr>
-          <w:p>
-            <w:pPr>
-              <w:jc w:val="center"/>
-            </w:pPr>
-            <w:r>
-              <w:rPr>
-                <w:rFonts w:ascii="Arial" w:hAnsi="Arial"/>
-                <w:b w:val="0"/>
-                <w:color w:val="333333"/>
-                <w:sz w:val="20"/>
-              </w:rPr>
-              <w:t>{%tr endfor %}</w:t>
-            </w:r>
-          </w:p>
-        </w:tc>
-        <w:tc>
-          <w:tcPr>
-            <w:tcW w:type="dxa" w:w="1624"/>
+        <w:tc>
+          <w:tcPr>
+            <w:tcW w:w="1624" w:type="dxa"/>
           </w:tcPr>
           <w:p/>
         </w:tc>
         <w:tc>
           <w:tcPr>
-            <w:tcW w:type="dxa" w:w="1624"/>
+            <w:tcW w:w="1624" w:type="dxa"/>
           </w:tcPr>
           <w:p/>
         </w:tc>
         <w:tc>
           <w:tcPr>
-            <w:tcW w:type="dxa" w:w="1624"/>
+            <w:tcW w:w="1624" w:type="dxa"/>
           </w:tcPr>
           <w:p/>
         </w:tc>
         <w:tc>
           <w:tcPr>
-            <w:tcW w:type="dxa" w:w="1624"/>
+            <w:tcW w:w="1624" w:type="dxa"/>
           </w:tcPr>
           <w:p/>
         </w:tc>
         <w:tc>
           <w:tcPr>
-            <w:tcW w:type="dxa" w:w="1624"/>
+            <w:tcW w:w="1624" w:type="dxa"/>
           </w:tcPr>
           <w:p/>
         </w:tc>
@@ -520,7 +800,21 @@
         </w:rPr>
       </w:pPr>
       <w:r>
-        <w:t>Desse modo, encaminho os autos {{tratamento}} para que delibere acerca da repercussão do referido acórdão no presente processo. O acórdão segue anexo a esta informação.</w:t>
+        <w:t>Desse modo, encaminho os autos {{tratamento}} para que delibere acerca da repercussão do referido acórdão no presente processo, sugerindo este corpo técnico, salvo melhor juízo, a suspensão da cobrança, com sobrestamento da execução até o trânsito em julgado do Mandado de Segurança nº 0807247-93.2025.8.20.0000 (</w:t>
+      </w:r>
+      <w:proofErr w:type="spellStart"/>
+      <w:r>
+        <w:t>arts</w:t>
+      </w:r>
+      <w:proofErr w:type="spellEnd"/>
+      <w:r>
+        <w:t>. 36, III, e 160 da Lei Complementar Estadual nº 464/2012), reservando-se eventual cancelamento definitivo da dívida para após a respectiva certificação</w:t>
+      </w:r>
+      <w:r>
+        <w:t xml:space="preserve">. </w:t>
+      </w:r>
+      <w:r>
+        <w:t>O acórdão segue anexo a esta informação.</w:t>
       </w:r>
     </w:p>
     <w:p>
@@ -542,6 +836,7 @@
         </w:rPr>
       </w:pPr>
       <w:r>
+        <w:lastRenderedPageBreak/>
         <w:t>Natal, data da assinatura eletrônica deste documento.</w:t>
       </w:r>
     </w:p>
@@ -719,7 +1014,7 @@
       <w:rPr>
         <w:rFonts w:ascii="Arial" w:hAnsi="Arial" w:cs="Arial"/>
         <w:b/>
-        <w:color w:val="808080"/>
+        <w:color w:val="808080" w:themeColor="background1" w:themeShade="80"/>
         <w:sz w:val="20"/>
         <w:szCs w:val="20"/>
       </w:rPr>
@@ -730,7 +1025,7 @@
       <w:rPr>
         <w:rFonts w:ascii="Arial" w:hAnsi="Arial" w:cs="Arial"/>
         <w:b/>
-        <w:color w:val="808080"/>
+        <w:color w:val="808080" w:themeColor="background1" w:themeShade="80"/>
         <w:sz w:val="20"/>
         <w:szCs w:val="20"/>
       </w:rPr>
@@ -739,7 +1034,7 @@
       <w:rPr>
         <w:rFonts w:ascii="Arial" w:hAnsi="Arial" w:cs="Arial"/>
         <w:b/>
-        <w:color w:val="2E5B3C"/>
+        <w:color w:val="808080" w:themeColor="background1" w:themeShade="80"/>
         <w:sz w:val="20"/>
         <w:szCs w:val="20"/>
       </w:rPr>
@@ -748,22 +1043,22 @@
   </w:p>
   <w:p>
     <w:pPr>
+      <w:pBdr>
+        <w:bottom w:val="single" w:sz="12" w:space="4" w:color="C8A84B"/>
+      </w:pBdr>
       <w:rPr>
         <w:rFonts w:ascii="Arial" w:hAnsi="Arial" w:cs="Arial"/>
         <w:b/>
-        <w:color w:val="808080"/>
+        <w:color w:val="808080" w:themeColor="background1" w:themeShade="80"/>
         <w:sz w:val="20"/>
         <w:szCs w:val="20"/>
       </w:rPr>
-      <w:pBdr>
-        <w:bottom w:val="single" w:sz="12" w:space="4" w:color="C8A84B"/>
-      </w:pBdr>
     </w:pPr>
     <w:r>
       <w:rPr>
         <w:rFonts w:ascii="Arial" w:hAnsi="Arial" w:cs="Arial"/>
         <w:b/>
-        <w:color w:val="2E5B3C"/>
+        <w:color w:val="808080" w:themeColor="background1" w:themeShade="80"/>
         <w:sz w:val="20"/>
         <w:szCs w:val="20"/>
       </w:rPr>

</xml_diff>